<commit_message>
Order references most-recent first and cite Mosca
Reference list now runs newest to oldest (FIPS 203/204/205 2024 first,
Shor 1997 last), with every in-text citation renumbered to match.

Also fixes an uncited entry: Mosca (2018) was listed but never referenced
in the body, and is now cited where the harvest-now-decrypt-later timeline
argument is made.

Co-Authored-By: Claude Opus 5 <noreply@anthropic.com>
</commit_message>
<xml_diff>
--- a/paper/PQC_Migration_Framework_Paper.docx
+++ b/paper/PQC_Migration_Framework_Paper.docx
@@ -233,7 +233,7 @@
           <w:i w:val="0"/>
           <w:sz w:val="20"/>
         </w:rPr>
-        <w:t>For three decades the security of digital infrastructure has rested on a small number of public-key constructions — RSA, elliptic-curve cryptography, and Diffie–Hellman — whose hardness assumptions are specific to classical computation. Shor demonstrated in 1994 that a quantum computer able to maintain sufficient coherent operations solves both integer factorisation and the discrete logarithm problem in polynomial time [1]. Every one of those constructions therefore has a known expiry date; what remains uncertain is only the date itself.</w:t>
+        <w:t>For three decades the security of digital infrastructure has rested on a small number of public-key constructions — RSA, elliptic-curve cryptography, and Diffie–Hellman — whose hardness assumptions are specific to classical computation. Shor demonstrated in 1994 that a quantum computer able to maintain sufficient coherent operations solves both integer factorisation and the discrete logarithm problem in polynomial time [11]. Every one of those constructions therefore has a known expiry date; what remains uncertain is only the date itself.</w:t>
       </w:r>
     </w:p>
     <w:p>
@@ -266,7 +266,7 @@
           <w:i w:val="0"/>
           <w:sz w:val="20"/>
         </w:rPr>
-        <w:t>. Any data whose confidentiality must outlive the arrival of cryptographically relevant quantum hardware — medical records, identity databases, state communications, long-lived financial instruments — is therefore already exposed, regardless of how strong today's cryptography is against today's adversaries.</w:t>
+        <w:t xml:space="preserve"> [9]. Any data whose confidentiality must outlive the arrival of cryptographically relevant quantum hardware — medical records, identity databases, state communications, long-lived financial instruments — is therefore already exposed, regardless of how strong today's cryptography is against today's adversaries.</w:t>
       </w:r>
     </w:p>
     <w:p>
@@ -281,7 +281,7 @@
           <w:i w:val="0"/>
           <w:sz w:val="20"/>
         </w:rPr>
-        <w:t>NIST completed the standardisation response in August 2024, publishing FIPS 203 (ML-KEM, for key encapsulation) [2], FIPS 204 (ML-DSA, for digital signatures) [3] and FIPS 205 (SLH-DSA, a stateless hash-based signature scheme) [4]. High-quality implementations followed quickly. The algorithmic question is, for practical purposes, settled.</w:t>
+        <w:t>NIST completed the standardisation response in August 2024, publishing FIPS 203 (ML-KEM, for key encapsulation) [1], FIPS 204 (ML-DSA, for digital signatures) [2] and FIPS 205 (SLH-DSA, a stateless hash-based signature scheme) [3]. High-quality implementations followed quickly. The algorithmic question is, for practical purposes, settled.</w:t>
       </w:r>
     </w:p>
     <w:p>
@@ -1751,7 +1751,7 @@
           <w:i w:val="0"/>
           <w:sz w:val="20"/>
         </w:rPr>
-        <w:t xml:space="preserve"> Tools and guidance exist for producing a cryptographic bill of materials — an inventory of where cryptography appears in a system. NIST's National Cybersecurity Center of Excellence identifies discovery as the necessary first step of any migration programme [5]. Inventory, however, is where these efforts stop. Knowing that line 42 calls RSA does not indicate what should replace it, and produces no code.</w:t>
+        <w:t xml:space="preserve"> Tools and guidance exist for producing a cryptographic bill of materials — an inventory of where cryptography appears in a system. NIST's National Cybersecurity Center of Excellence identifies discovery as the necessary first step of any migration programme [4]. Inventory, however, is where these efforts stop. Knowing that line 42 calls RSA does not indicate what should replace it, and produces no code.</w:t>
       </w:r>
     </w:p>
     <w:p>
@@ -1775,7 +1775,7 @@
           <w:i w:val="0"/>
           <w:sz w:val="20"/>
         </w:rPr>
-        <w:t xml:space="preserve"> NIST's preparatory guidance [6] and national directives such as CNSA 2.0 establish timelines and set crypto-agility as an objective. These documents are, by design, prescriptive about goals and silent about implementation. They tell an organisation that it must migrate, not how to migrate a specific repository.</w:t>
+        <w:t xml:space="preserve"> NIST's preparatory guidance [7] and national directives such as CNSA 2.0 establish timelines and set crypto-agility as an objective. These documents are, by design, prescriptive about goals and silent about implementation. They tell an organisation that it must migrate, not how to migrate a specific repository.</w:t>
       </w:r>
     </w:p>
     <w:p>
@@ -1799,7 +1799,7 @@
           <w:i w:val="0"/>
           <w:sz w:val="20"/>
         </w:rPr>
-        <w:t xml:space="preserve"> The Open Quantum Safe project and its liboqs library [7] made the new primitives broadly available well before standardisation concluded, and pure-Python implementations now exist for ML-KEM and ML-DSA [8], [9]. This work supplies the destination of a migration without addressing the journey.</w:t>
+        <w:t xml:space="preserve"> The Open Quantum Safe project and its liboqs library [10] made the new primitives broadly available well before standardisation concluded, and pure-Python implementations now exist for ML-KEM and ML-DSA [5], [6]. This work supplies the destination of a migration without addressing the journey.</w:t>
       </w:r>
     </w:p>
     <w:p>
@@ -1823,7 +1823,7 @@
           <w:i w:val="0"/>
           <w:sz w:val="20"/>
         </w:rPr>
-        <w:t xml:space="preserve"> A growing literature applies large language models to source-to-source transformation tasks [10]. Results are encouraging on isolated functions, and uniformly carry the same caveat: the output requires human verification, because a plausible-looking patch and a correct one are indistinguishable without execution. Applied naively to cryptographic code, where a silent failure may produce something that runs but protects nothing, this caveat is disqualifying rather than cautionary.</w:t>
+        <w:t xml:space="preserve"> A growing literature applies large language models to source-to-source transformation tasks [8]. Results are encouraging on isolated functions, and uniformly carry the same caveat: the output requires human verification, because a plausible-looking patch and a correct one are indistinguishable without execution. Applied naively to cryptographic code, where a silent failure may produce something that runs but protects nothing, this caveat is disqualifying rather than cautionary.</w:t>
       </w:r>
     </w:p>
     <w:p>
@@ -3082,7 +3082,7 @@
           <w:i w:val="0"/>
           <w:sz w:val="20"/>
         </w:rPr>
-        <w:t xml:space="preserve"> 1.4.0 (ML-DSA) [8], [9], with liboqs supported as the preferred backend. Classical cryptography in the sample applications and the classical benchmark baselines use PyCA </w:t>
+        <w:t xml:space="preserve"> 1.4.0 (ML-DSA) [5], [6], with liboqs supported as the preferred backend. Classical cryptography in the sample applications and the classical benchmark baselines use PyCA </w:t>
       </w:r>
       <w:r>
         <w:rPr>
@@ -6038,7 +6038,7 @@
           <w:color w:val="A03020"/>
           <w:sz w:val="18"/>
         </w:rPr>
-        <w:t>[ Verify every entry against the published source before submission, and renumber if you add references from your own survey. ]</w:t>
+        <w:t>[ Entries are ordered most-recent first. Verify every one against the published source before submission, and renumber if you add references from your own survey. ]</w:t>
       </w:r>
     </w:p>
     <w:p>
@@ -6053,7 +6053,7 @@
           <w:i w:val="0"/>
           <w:sz w:val="20"/>
         </w:rPr>
-        <w:t xml:space="preserve">[1] P. W. Shor, "Polynomial-time algorithms for prime factorization and discrete logarithms on a quantum computer," </w:t>
+        <w:t xml:space="preserve">[1] National Institute of Standards and Technology, </w:t>
       </w:r>
       <w:r>
         <w:rPr>
@@ -6062,7 +6062,7 @@
           <w:i/>
           <w:sz w:val="20"/>
         </w:rPr>
-        <w:t>SIAM Journal on Computing</w:t>
+        <w:t>Module-Lattice-Based Key-Encapsulation Mechanism Standard</w:t>
       </w:r>
       <w:r>
         <w:rPr>
@@ -6071,7 +6071,7 @@
           <w:i w:val="0"/>
           <w:sz w:val="20"/>
         </w:rPr>
-        <w:t>, vol. 26, no. 5, pp. 1484–1509, 1997.</w:t>
+        <w:t>, FIPS 203, Aug. 2024.</w:t>
       </w:r>
     </w:p>
     <w:p>
@@ -6095,7 +6095,7 @@
           <w:i/>
           <w:sz w:val="20"/>
         </w:rPr>
-        <w:t>Module-Lattice-Based Key-Encapsulation Mechanism Standard</w:t>
+        <w:t>Module-Lattice-Based Digital Signature Standard</w:t>
       </w:r>
       <w:r>
         <w:rPr>
@@ -6104,7 +6104,7 @@
           <w:i w:val="0"/>
           <w:sz w:val="20"/>
         </w:rPr>
-        <w:t>, FIPS 203, Aug. 2024.</w:t>
+        <w:t>, FIPS 204, Aug. 2024.</w:t>
       </w:r>
     </w:p>
     <w:p>
@@ -6128,7 +6128,7 @@
           <w:i/>
           <w:sz w:val="20"/>
         </w:rPr>
-        <w:t>Module-Lattice-Based Digital Signature Standard</w:t>
+        <w:t>Stateless Hash-Based Digital Signature Standard</w:t>
       </w:r>
       <w:r>
         <w:rPr>
@@ -6137,7 +6137,7 @@
           <w:i w:val="0"/>
           <w:sz w:val="20"/>
         </w:rPr>
-        <w:t>, FIPS 204, Aug. 2024.</w:t>
+        <w:t>, FIPS 205, Aug. 2024.</w:t>
       </w:r>
     </w:p>
     <w:p>
@@ -6152,7 +6152,7 @@
           <w:i w:val="0"/>
           <w:sz w:val="20"/>
         </w:rPr>
-        <w:t xml:space="preserve">[4] National Institute of Standards and Technology, </w:t>
+        <w:t xml:space="preserve">[4] National Cybersecurity Center of Excellence, </w:t>
       </w:r>
       <w:r>
         <w:rPr>
@@ -6161,7 +6161,7 @@
           <w:i/>
           <w:sz w:val="20"/>
         </w:rPr>
-        <w:t>Stateless Hash-Based Digital Signature Standard</w:t>
+        <w:t>Migration to Post-Quantum Cryptography</w:t>
       </w:r>
       <w:r>
         <w:rPr>
@@ -6170,7 +6170,7 @@
           <w:i w:val="0"/>
           <w:sz w:val="20"/>
         </w:rPr>
-        <w:t>, FIPS 205, Aug. 2024.</w:t>
+        <w:t>, NIST SP 1800-38, National Institute of Standards and Technology. Confirm the volume and revision date you cite.</w:t>
       </w:r>
     </w:p>
     <w:p>
@@ -6185,7 +6185,37 @@
           <w:i w:val="0"/>
           <w:sz w:val="20"/>
         </w:rPr>
-        <w:t xml:space="preserve">[5] National Cybersecurity Center of Excellence, </w:t>
+        <w:t>[5] G. Pope, "kyber-py: A pure-Python implementation of ML-KEM (FIPS 203)," software repository, version 1.2.0.</w:t>
+      </w:r>
+    </w:p>
+    <w:p>
+      <w:pPr>
+        <w:spacing w:after="100"/>
+        <w:jc w:val="both"/>
+      </w:pPr>
+      <w:r>
+        <w:rPr>
+          <w:rFonts w:ascii="Times New Roman" w:hAnsi="Times New Roman"/>
+          <w:b w:val="0"/>
+          <w:i w:val="0"/>
+          <w:sz w:val="20"/>
+        </w:rPr>
+        <w:t>[6] G. Pope, "dilithium-py: A pure-Python implementation of ML-DSA (FIPS 204)," software repository, version 1.4.0.</w:t>
+      </w:r>
+    </w:p>
+    <w:p>
+      <w:pPr>
+        <w:spacing w:after="100"/>
+        <w:jc w:val="both"/>
+      </w:pPr>
+      <w:r>
+        <w:rPr>
+          <w:rFonts w:ascii="Times New Roman" w:hAnsi="Times New Roman"/>
+          <w:b w:val="0"/>
+          <w:i w:val="0"/>
+          <w:sz w:val="20"/>
+        </w:rPr>
+        <w:t xml:space="preserve">[7] W. Barker, W. Polk, and M. Souppaya, </w:t>
       </w:r>
       <w:r>
         <w:rPr>
@@ -6194,7 +6224,7 @@
           <w:i/>
           <w:sz w:val="20"/>
         </w:rPr>
-        <w:t>Migration to Post-Quantum Cryptography</w:t>
+        <w:t>Getting Ready for Post-Quantum Cryptography: Exploring Challenges Associated with Adopting and Using Post-Quantum Cryptographic Algorithms</w:t>
       </w:r>
       <w:r>
         <w:rPr>
@@ -6203,7 +6233,7 @@
           <w:i w:val="0"/>
           <w:sz w:val="20"/>
         </w:rPr>
-        <w:t>, NIST SP 1800-38, National Institute of Standards and Technology.</w:t>
+        <w:t>, NIST Cybersecurity White Paper, 2021.</w:t>
       </w:r>
     </w:p>
     <w:p>
@@ -6218,7 +6248,22 @@
           <w:i w:val="0"/>
           <w:sz w:val="20"/>
         </w:rPr>
-        <w:t xml:space="preserve">[6] W. Barker, W. Polk, and M. Souppaya, </w:t>
+        <w:t>[8] M. Chen et al., "Evaluating large language models trained on code," arXiv:2107.03374, 2021.</w:t>
+      </w:r>
+    </w:p>
+    <w:p>
+      <w:pPr>
+        <w:spacing w:after="100"/>
+        <w:jc w:val="both"/>
+      </w:pPr>
+      <w:r>
+        <w:rPr>
+          <w:rFonts w:ascii="Times New Roman" w:hAnsi="Times New Roman"/>
+          <w:b w:val="0"/>
+          <w:i w:val="0"/>
+          <w:sz w:val="20"/>
+        </w:rPr>
+        <w:t xml:space="preserve">[9] M. Mosca, "Cybersecurity in an era with quantum computers: Will we be ready?," </w:t>
       </w:r>
       <w:r>
         <w:rPr>
@@ -6227,7 +6272,7 @@
           <w:i/>
           <w:sz w:val="20"/>
         </w:rPr>
-        <w:t>Getting Ready for Post-Quantum Cryptography: Exploring Challenges Associated with Adopting and Using Post-Quantum Cryptographic Algorithms</w:t>
+        <w:t>IEEE Security &amp; Privacy</w:t>
       </w:r>
       <w:r>
         <w:rPr>
@@ -6236,7 +6281,7 @@
           <w:i w:val="0"/>
           <w:sz w:val="20"/>
         </w:rPr>
-        <w:t>, NIST Cybersecurity White Paper, 2021.</w:t>
+        <w:t>, vol. 16, no. 5, pp. 38-41, 2018.</w:t>
       </w:r>
     </w:p>
     <w:p>
@@ -6251,7 +6296,7 @@
           <w:i w:val="0"/>
           <w:sz w:val="20"/>
         </w:rPr>
-        <w:t xml:space="preserve">[7] D. Stebila and M. Mosca, "Post-quantum key exchange for the Internet and the Open Quantum Safe project," in </w:t>
+        <w:t xml:space="preserve">[10] D. Stebila and M. Mosca, "Post-quantum key exchange for the Internet and the Open Quantum Safe project," in </w:t>
       </w:r>
       <w:r>
         <w:rPr>
@@ -6269,7 +6314,7 @@
           <w:i w:val="0"/>
           <w:sz w:val="20"/>
         </w:rPr>
-        <w:t>, LNCS vol. 10532, pp. 14–37.</w:t>
+        <w:t>, LNCS vol. 10532, pp. 14-37.</w:t>
       </w:r>
     </w:p>
     <w:p>
@@ -6284,14 +6329,17 @@
           <w:i w:val="0"/>
           <w:sz w:val="20"/>
         </w:rPr>
-        <w:t>[8] G. Pope, "kyber-py: A pure-Python implementation of ML-KEM (FIPS 203)," software repository.</w:t>
-      </w:r>
-    </w:p>
-    <w:p>
-      <w:pPr>
-        <w:spacing w:after="100"/>
-        <w:jc w:val="both"/>
-      </w:pPr>
+        <w:t xml:space="preserve">[11] P. W. Shor, "Polynomial-time algorithms for prime factorization and discrete logarithms on a quantum computer," </w:t>
+      </w:r>
+      <w:r>
+        <w:rPr>
+          <w:rFonts w:ascii="Times New Roman" w:hAnsi="Times New Roman"/>
+          <w:b w:val="0"/>
+          <w:i/>
+          <w:sz w:val="20"/>
+        </w:rPr>
+        <w:t>SIAM Journal on Computing</w:t>
+      </w:r>
       <w:r>
         <w:rPr>
           <w:rFonts w:ascii="Times New Roman" w:hAnsi="Times New Roman"/>
@@ -6299,55 +6347,7 @@
           <w:i w:val="0"/>
           <w:sz w:val="20"/>
         </w:rPr>
-        <w:t>[9] G. Pope, "dilithium-py: A pure-Python implementation of ML-DSA (FIPS 204)," software repository.</w:t>
-      </w:r>
-    </w:p>
-    <w:p>
-      <w:pPr>
-        <w:spacing w:after="100"/>
-        <w:jc w:val="both"/>
-      </w:pPr>
-      <w:r>
-        <w:rPr>
-          <w:rFonts w:ascii="Times New Roman" w:hAnsi="Times New Roman"/>
-          <w:b w:val="0"/>
-          <w:i w:val="0"/>
-          <w:sz w:val="20"/>
-        </w:rPr>
-        <w:t>[10] M. Chen et al., "Evaluating large language models trained on code," arXiv:2107.03374, 2021.</w:t>
-      </w:r>
-    </w:p>
-    <w:p>
-      <w:pPr>
-        <w:spacing w:after="100"/>
-        <w:jc w:val="both"/>
-      </w:pPr>
-      <w:r>
-        <w:rPr>
-          <w:rFonts w:ascii="Times New Roman" w:hAnsi="Times New Roman"/>
-          <w:b w:val="0"/>
-          <w:i w:val="0"/>
-          <w:sz w:val="20"/>
-        </w:rPr>
-        <w:t xml:space="preserve">[11] M. Mosca, "Cybersecurity in an era with quantum computers: Will we be ready?," </w:t>
-      </w:r>
-      <w:r>
-        <w:rPr>
-          <w:rFonts w:ascii="Times New Roman" w:hAnsi="Times New Roman"/>
-          <w:b w:val="0"/>
-          <w:i/>
-          <w:sz w:val="20"/>
-        </w:rPr>
-        <w:t>IEEE Security &amp; Privacy</w:t>
-      </w:r>
-      <w:r>
-        <w:rPr>
-          <w:rFonts w:ascii="Times New Roman" w:hAnsi="Times New Roman"/>
-          <w:b w:val="0"/>
-          <w:i w:val="0"/>
-          <w:sz w:val="20"/>
-        </w:rPr>
-        <w:t>, vol. 16, no. 5, pp. 38–41, 2018.</w:t>
+        <w:t>, vol. 26, no. 5, pp. 1484-1509, 1997.</w:t>
       </w:r>
     </w:p>
     <w:sectPr>

</xml_diff>